<commit_message>
moved project files to root
</commit_message>
<xml_diff>
--- a/Term Project - part 2/part 2/Gym Exercises System.docx
+++ b/Term Project - part 2/part 2/Gym Exercises System.docx
@@ -1,6 +1,6 @@
 
 <file path=word/document.xml><?xml version="1.0" encoding="utf-8"?>
-<w:document xmlns:wpc="http://schemas.microsoft.com/office/word/2010/wordprocessingCanvas" xmlns:cx="http://schemas.microsoft.com/office/drawing/2014/chartex" xmlns:cx1="http://schemas.microsoft.com/office/drawing/2015/9/8/chartex" xmlns:cx2="http://schemas.microsoft.com/office/drawing/2015/10/21/chartex" xmlns:cx3="http://schemas.microsoft.com/office/drawing/2016/5/9/chartex" xmlns:cx4="http://schemas.microsoft.com/office/drawing/2016/5/10/chartex" xmlns:cx5="http://schemas.microsoft.com/office/drawing/2016/5/11/chartex" xmlns:cx6="http://schemas.microsoft.com/office/drawing/2016/5/12/chartex" xmlns:cx7="http://schemas.microsoft.com/office/drawing/2016/5/13/chartex" xmlns:cx8="http://schemas.microsoft.com/office/drawing/2016/5/14/chartex" xmlns:mc="http://schemas.openxmlformats.org/markup-compatibility/2006" xmlns:aink="http://schemas.microsoft.com/office/drawing/2016/ink" xmlns:am3d="http://schemas.microsoft.com/office/drawing/2017/model3d" xmlns:o="urn:schemas-microsoft-com:office:office" xmlns:r="http://schemas.openxmlformats.org/officeDocument/2006/relationships" xmlns:m="http://schemas.openxmlformats.org/officeDocument/2006/math" xmlns:v="urn:schemas-microsoft-com:vml" xmlns:wp14="http://schemas.microsoft.com/office/word/2010/wordprocessingDrawing" xmlns:wp="http://schemas.openxmlformats.org/drawingml/2006/wordprocessingDrawing" xmlns:w10="urn:schemas-microsoft-com:office:word" xmlns:w="http://schemas.openxmlformats.org/wordprocessingml/2006/main" xmlns:w14="http://schemas.microsoft.com/office/word/2010/wordml" xmlns:w15="http://schemas.microsoft.com/office/word/2012/wordml" xmlns:w16cex="http://schemas.microsoft.com/office/word/2018/wordml/cex" xmlns:w16cid="http://schemas.microsoft.com/office/word/2016/wordml/cid" xmlns:w16="http://schemas.microsoft.com/office/word/2018/wordml" xmlns:w16sdtdh="http://schemas.microsoft.com/office/word/2020/wordml/sdtdatahash" xmlns:w16se="http://schemas.microsoft.com/office/word/2015/wordml/symex" xmlns:wpg="http://schemas.microsoft.com/office/word/2010/wordprocessingGroup" xmlns:wpi="http://schemas.microsoft.com/office/word/2010/wordprocessingInk" xmlns:wne="http://schemas.microsoft.com/office/word/2006/wordml" xmlns:wps="http://schemas.microsoft.com/office/word/2010/wordprocessingShape" mc:Ignorable="w14 w15 w16se w16cid w16 w16cex w16sdtdh wp14">
+<w:document xmlns:wpc="http://schemas.microsoft.com/office/word/2010/wordprocessingCanvas" xmlns:cx="http://schemas.microsoft.com/office/drawing/2014/chartex" xmlns:cx1="http://schemas.microsoft.com/office/drawing/2015/9/8/chartex" xmlns:cx2="http://schemas.microsoft.com/office/drawing/2015/10/21/chartex" xmlns:cx3="http://schemas.microsoft.com/office/drawing/2016/5/9/chartex" xmlns:cx4="http://schemas.microsoft.com/office/drawing/2016/5/10/chartex" xmlns:cx5="http://schemas.microsoft.com/office/drawing/2016/5/11/chartex" xmlns:cx6="http://schemas.microsoft.com/office/drawing/2016/5/12/chartex" xmlns:cx7="http://schemas.microsoft.com/office/drawing/2016/5/13/chartex" xmlns:cx8="http://schemas.microsoft.com/office/drawing/2016/5/14/chartex" xmlns:mc="http://schemas.openxmlformats.org/markup-compatibility/2006" xmlns:aink="http://schemas.microsoft.com/office/drawing/2016/ink" xmlns:am3d="http://schemas.microsoft.com/office/drawing/2017/model3d" xmlns:o="urn:schemas-microsoft-com:office:office" xmlns:oel="http://schemas.microsoft.com/office/2019/extlst" xmlns:r="http://schemas.openxmlformats.org/officeDocument/2006/relationships" xmlns:m="http://schemas.openxmlformats.org/officeDocument/2006/math" xmlns:v="urn:schemas-microsoft-com:vml" xmlns:wp14="http://schemas.microsoft.com/office/word/2010/wordprocessingDrawing" xmlns:wp="http://schemas.openxmlformats.org/drawingml/2006/wordprocessingDrawing" xmlns:w10="urn:schemas-microsoft-com:office:word" xmlns:w="http://schemas.openxmlformats.org/wordprocessingml/2006/main" xmlns:w14="http://schemas.microsoft.com/office/word/2010/wordml" xmlns:w15="http://schemas.microsoft.com/office/word/2012/wordml" xmlns:w16cex="http://schemas.microsoft.com/office/word/2018/wordml/cex" xmlns:w16cid="http://schemas.microsoft.com/office/word/2016/wordml/cid" xmlns:w16="http://schemas.microsoft.com/office/word/2018/wordml" xmlns:w16du="http://schemas.microsoft.com/office/word/2023/wordml/word16du" xmlns:w16sdtdh="http://schemas.microsoft.com/office/word/2020/wordml/sdtdatahash" xmlns:w16sdtfl="http://schemas.microsoft.com/office/word/2024/wordml/sdtformatlock" xmlns:w16se="http://schemas.microsoft.com/office/word/2015/wordml/symex" xmlns:wpg="http://schemas.microsoft.com/office/word/2010/wordprocessingGroup" xmlns:wpi="http://schemas.microsoft.com/office/word/2010/wordprocessingInk" xmlns:wne="http://schemas.microsoft.com/office/word/2006/wordml" xmlns:wps="http://schemas.microsoft.com/office/word/2010/wordprocessingShape" mc:Ignorable="w14 w15 w16se w16cid w16 w16cex w16sdtdh w16sdtfl w16du wp14">
   <w:body>
     <w:p>
       <w:pPr>
@@ -199,6 +199,9 @@
         </w:numPr>
       </w:pPr>
       <w:r>
+        <w:rPr>
+          <w:noProof/>
+        </w:rPr>
         <w:lastRenderedPageBreak/>
         <w:drawing>
           <wp:inline distT="0" distB="0" distL="0" distR="0" wp14:anchorId="64F9D3E6" wp14:editId="725A0C35">
@@ -237,6 +240,9 @@
         </w:drawing>
       </w:r>
       <w:r>
+        <w:rPr>
+          <w:noProof/>
+        </w:rPr>
         <w:drawing>
           <wp:inline distT="0" distB="0" distL="0" distR="0" wp14:anchorId="223AD943" wp14:editId="1E981546">
             <wp:extent cx="5943600" cy="1984375"/>
@@ -274,6 +280,9 @@
         </w:drawing>
       </w:r>
       <w:r>
+        <w:rPr>
+          <w:noProof/>
+        </w:rPr>
         <w:drawing>
           <wp:inline distT="0" distB="0" distL="0" distR="0" wp14:anchorId="40F7DF0C" wp14:editId="33724E08">
             <wp:extent cx="5943600" cy="2440940"/>
@@ -311,6 +320,9 @@
         </w:drawing>
       </w:r>
       <w:r>
+        <w:rPr>
+          <w:noProof/>
+        </w:rPr>
         <w:lastRenderedPageBreak/>
         <w:drawing>
           <wp:inline distT="0" distB="0" distL="0" distR="0" wp14:anchorId="0A27EAE7" wp14:editId="438C6C4C">
@@ -349,6 +361,9 @@
         </w:drawing>
       </w:r>
       <w:r>
+        <w:rPr>
+          <w:noProof/>
+        </w:rPr>
         <w:drawing>
           <wp:inline distT="0" distB="0" distL="0" distR="0" wp14:anchorId="316687E6" wp14:editId="3B6F33F8">
             <wp:extent cx="5943600" cy="2948305"/>
@@ -469,21 +484,54 @@
     </w:p>
     <w:p>
       <w:pPr>
-        <w:pStyle w:val="NormalWeb"/>
-        <w:numPr>
-          <w:ilvl w:val="0"/>
-          <w:numId w:val="7"/>
-        </w:numPr>
+        <w:pStyle w:val="Subtitle"/>
       </w:pPr>
       <w:r>
         <w:t>Team Contributions</w:t>
       </w:r>
       <w:r>
+        <w:t>:</w:t>
+      </w:r>
+      <w:r>
         <w:br/>
-        <w:t>Each team member contributed to different parts of the project including design, coding, and testing. Tasks were divided to ensure all requirements were completed efficiently.</w:t>
+      </w:r>
+      <w:proofErr w:type="spellStart"/>
+      <w:r>
+        <w:t>Hajed</w:t>
+      </w:r>
+      <w:proofErr w:type="spellEnd"/>
+      <w:r>
+        <w:t xml:space="preserve"> Al-</w:t>
+      </w:r>
+      <w:proofErr w:type="spellStart"/>
+      <w:r>
+        <w:t>habsi</w:t>
+      </w:r>
+      <w:proofErr w:type="spellEnd"/>
+      <w:r>
+        <w:t>: Index + About</w:t>
+      </w:r>
+      <w:r>
+        <w:br/>
+        <w:t>Abdulrhman Al-Alawi: Exercises + plans</w:t>
+      </w:r>
+      <w:r>
+        <w:br/>
+        <w:t>Mohammed Al-Hinai: CSS + Contact form</w:t>
+      </w:r>
+      <w:r>
+        <w:br/>
+        <w:t>Ahmed Al-</w:t>
+      </w:r>
+      <w:proofErr w:type="spellStart"/>
+      <w:r>
+        <w:t>Nadabi</w:t>
+      </w:r>
+      <w:proofErr w:type="spellEnd"/>
+      <w:r>
+        <w:t>: Reviewed the code pages + Report</w:t>
       </w:r>
     </w:p>
-    <w:p/>
     <w:sectPr>
       <w:pgSz w:w="12240" w:h="15840"/>
       <w:pgMar w:top="1440" w:right="1440" w:bottom="1440" w:left="1440" w:header="720" w:footer="720" w:gutter="0"/>
@@ -495,7 +543,7 @@
 </file>
 
 <file path=word/numbering.xml><?xml version="1.0" encoding="utf-8"?>
-<w:numbering xmlns:wpc="http://schemas.microsoft.com/office/word/2010/wordprocessingCanvas" xmlns:cx="http://schemas.microsoft.com/office/drawing/2014/chartex" xmlns:cx1="http://schemas.microsoft.com/office/drawing/2015/9/8/chartex" xmlns:cx2="http://schemas.microsoft.com/office/drawing/2015/10/21/chartex" xmlns:cx3="http://schemas.microsoft.com/office/drawing/2016/5/9/chartex" xmlns:cx4="http://schemas.microsoft.com/office/drawing/2016/5/10/chartex" xmlns:cx5="http://schemas.microsoft.com/office/drawing/2016/5/11/chartex" xmlns:cx6="http://schemas.microsoft.com/office/drawing/2016/5/12/chartex" xmlns:cx7="http://schemas.microsoft.com/office/drawing/2016/5/13/chartex" xmlns:cx8="http://schemas.microsoft.com/office/drawing/2016/5/14/chartex" xmlns:mc="http://schemas.openxmlformats.org/markup-compatibility/2006" xmlns:aink="http://schemas.microsoft.com/office/drawing/2016/ink" xmlns:am3d="http://schemas.microsoft.com/office/drawing/2017/model3d" xmlns:o="urn:schemas-microsoft-com:office:office" xmlns:r="http://schemas.openxmlformats.org/officeDocument/2006/relationships" xmlns:m="http://schemas.openxmlformats.org/officeDocument/2006/math" xmlns:v="urn:schemas-microsoft-com:vml" xmlns:wp14="http://schemas.microsoft.com/office/word/2010/wordprocessingDrawing" xmlns:wp="http://schemas.openxmlformats.org/drawingml/2006/wordprocessingDrawing" xmlns:w10="urn:schemas-microsoft-com:office:word" xmlns:w="http://schemas.openxmlformats.org/wordprocessingml/2006/main" xmlns:w14="http://schemas.microsoft.com/office/word/2010/wordml" xmlns:w15="http://schemas.microsoft.com/office/word/2012/wordml" xmlns:w16cex="http://schemas.microsoft.com/office/word/2018/wordml/cex" xmlns:w16cid="http://schemas.microsoft.com/office/word/2016/wordml/cid" xmlns:w16="http://schemas.microsoft.com/office/word/2018/wordml" xmlns:w16sdtdh="http://schemas.microsoft.com/office/word/2020/wordml/sdtdatahash" xmlns:w16se="http://schemas.microsoft.com/office/word/2015/wordml/symex" xmlns:wpg="http://schemas.microsoft.com/office/word/2010/wordprocessingGroup" xmlns:wpi="http://schemas.microsoft.com/office/word/2010/wordprocessingInk" xmlns:wne="http://schemas.microsoft.com/office/word/2006/wordml" xmlns:wps="http://schemas.microsoft.com/office/word/2010/wordprocessingShape" mc:Ignorable="w14 w15 w16se w16cid w16 w16cex w16sdtdh wp14">
+<w:numbering xmlns:wpc="http://schemas.microsoft.com/office/word/2010/wordprocessingCanvas" xmlns:cx="http://schemas.microsoft.com/office/drawing/2014/chartex" xmlns:cx1="http://schemas.microsoft.com/office/drawing/2015/9/8/chartex" xmlns:cx2="http://schemas.microsoft.com/office/drawing/2015/10/21/chartex" xmlns:cx3="http://schemas.microsoft.com/office/drawing/2016/5/9/chartex" xmlns:cx4="http://schemas.microsoft.com/office/drawing/2016/5/10/chartex" xmlns:cx5="http://schemas.microsoft.com/office/drawing/2016/5/11/chartex" xmlns:cx6="http://schemas.microsoft.com/office/drawing/2016/5/12/chartex" xmlns:cx7="http://schemas.microsoft.com/office/drawing/2016/5/13/chartex" xmlns:cx8="http://schemas.microsoft.com/office/drawing/2016/5/14/chartex" xmlns:mc="http://schemas.openxmlformats.org/markup-compatibility/2006" xmlns:aink="http://schemas.microsoft.com/office/drawing/2016/ink" xmlns:am3d="http://schemas.microsoft.com/office/drawing/2017/model3d" xmlns:o="urn:schemas-microsoft-com:office:office" xmlns:oel="http://schemas.microsoft.com/office/2019/extlst" xmlns:r="http://schemas.openxmlformats.org/officeDocument/2006/relationships" xmlns:m="http://schemas.openxmlformats.org/officeDocument/2006/math" xmlns:v="urn:schemas-microsoft-com:vml" xmlns:wp14="http://schemas.microsoft.com/office/word/2010/wordprocessingDrawing" xmlns:wp="http://schemas.openxmlformats.org/drawingml/2006/wordprocessingDrawing" xmlns:w10="urn:schemas-microsoft-com:office:word" xmlns:w="http://schemas.openxmlformats.org/wordprocessingml/2006/main" xmlns:w14="http://schemas.microsoft.com/office/word/2010/wordml" xmlns:w15="http://schemas.microsoft.com/office/word/2012/wordml" xmlns:w16cex="http://schemas.microsoft.com/office/word/2018/wordml/cex" xmlns:w16cid="http://schemas.microsoft.com/office/word/2016/wordml/cid" xmlns:w16="http://schemas.microsoft.com/office/word/2018/wordml" xmlns:w16du="http://schemas.microsoft.com/office/word/2023/wordml/word16du" xmlns:w16sdtdh="http://schemas.microsoft.com/office/word/2020/wordml/sdtdatahash" xmlns:w16sdtfl="http://schemas.microsoft.com/office/word/2024/wordml/sdtformatlock" xmlns:w16se="http://schemas.microsoft.com/office/word/2015/wordml/symex" xmlns:wpg="http://schemas.microsoft.com/office/word/2010/wordprocessingGroup" xmlns:wpi="http://schemas.microsoft.com/office/word/2010/wordprocessingInk" xmlns:wne="http://schemas.microsoft.com/office/word/2006/wordml" xmlns:wps="http://schemas.microsoft.com/office/word/2010/wordprocessingShape" mc:Ignorable="w14 w15 w16se w16cid w16 w16cex w16sdtdh w16sdtfl w16du wp14">
   <w:abstractNum w:abstractNumId="0" w15:restartNumberingAfterBreak="0">
     <w:nsid w:val="2A9854B4"/>
     <w:multiLevelType w:val="multilevel"/>
@@ -1395,32 +1443,32 @@
       </w:pPr>
     </w:lvl>
   </w:abstractNum>
-  <w:num w:numId="1">
+  <w:num w:numId="1" w16cid:durableId="1437091390">
     <w:abstractNumId w:val="6"/>
   </w:num>
-  <w:num w:numId="2">
+  <w:num w:numId="2" w16cid:durableId="511992373">
     <w:abstractNumId w:val="1"/>
   </w:num>
-  <w:num w:numId="3">
+  <w:num w:numId="3" w16cid:durableId="1435520121">
     <w:abstractNumId w:val="4"/>
   </w:num>
-  <w:num w:numId="4">
+  <w:num w:numId="4" w16cid:durableId="233901698">
     <w:abstractNumId w:val="0"/>
   </w:num>
-  <w:num w:numId="5">
+  <w:num w:numId="5" w16cid:durableId="12852923">
     <w:abstractNumId w:val="3"/>
   </w:num>
-  <w:num w:numId="6">
+  <w:num w:numId="6" w16cid:durableId="2094233196">
     <w:abstractNumId w:val="5"/>
   </w:num>
-  <w:num w:numId="7">
+  <w:num w:numId="7" w16cid:durableId="1135103212">
     <w:abstractNumId w:val="2"/>
   </w:num>
 </w:numbering>
 </file>
 
 <file path=word/styles.xml><?xml version="1.0" encoding="utf-8"?>
-<w:styles xmlns:mc="http://schemas.openxmlformats.org/markup-compatibility/2006" xmlns:r="http://schemas.openxmlformats.org/officeDocument/2006/relationships" xmlns:w="http://schemas.openxmlformats.org/wordprocessingml/2006/main" xmlns:w14="http://schemas.microsoft.com/office/word/2010/wordml" xmlns:w15="http://schemas.microsoft.com/office/word/2012/wordml" xmlns:w16cex="http://schemas.microsoft.com/office/word/2018/wordml/cex" xmlns:w16cid="http://schemas.microsoft.com/office/word/2016/wordml/cid" xmlns:w16="http://schemas.microsoft.com/office/word/2018/wordml" xmlns:w16sdtdh="http://schemas.microsoft.com/office/word/2020/wordml/sdtdatahash" xmlns:w16se="http://schemas.microsoft.com/office/word/2015/wordml/symex" mc:Ignorable="w14 w15 w16se w16cid w16 w16cex w16sdtdh">
+<w:styles xmlns:mc="http://schemas.openxmlformats.org/markup-compatibility/2006" xmlns:r="http://schemas.openxmlformats.org/officeDocument/2006/relationships" xmlns:w="http://schemas.openxmlformats.org/wordprocessingml/2006/main" xmlns:w14="http://schemas.microsoft.com/office/word/2010/wordml" xmlns:w15="http://schemas.microsoft.com/office/word/2012/wordml" xmlns:w16cex="http://schemas.microsoft.com/office/word/2018/wordml/cex" xmlns:w16cid="http://schemas.microsoft.com/office/word/2016/wordml/cid" xmlns:w16="http://schemas.microsoft.com/office/word/2018/wordml" xmlns:w16du="http://schemas.microsoft.com/office/word/2023/wordml/word16du" xmlns:w16sdtdh="http://schemas.microsoft.com/office/word/2020/wordml/sdtdatahash" xmlns:w16sdtfl="http://schemas.microsoft.com/office/word/2024/wordml/sdtformatlock" xmlns:w16se="http://schemas.microsoft.com/office/word/2015/wordml/symex" mc:Ignorable="w14 w15 w16se w16cid w16 w16cex w16sdtdh w16sdtfl w16du">
   <w:docDefaults>
     <w:rPrDefault>
       <w:rPr>
@@ -1849,7 +1897,6 @@
     <w:name w:val="Normal (Web)"/>
     <w:basedOn w:val="Normal"/>
     <w:uiPriority w:val="99"/>
-    <w:semiHidden/>
     <w:unhideWhenUsed/>
     <w:rsid w:val="00DF1B05"/>
     <w:pPr>
@@ -1859,6 +1906,37 @@
       <w:rFonts w:ascii="Times New Roman" w:eastAsia="Times New Roman" w:hAnsi="Times New Roman" w:cs="Times New Roman"/>
       <w:sz w:val="24"/>
       <w:szCs w:val="24"/>
+    </w:rPr>
+  </w:style>
+  <w:style w:type="paragraph" w:styleId="Subtitle">
+    <w:name w:val="Subtitle"/>
+    <w:basedOn w:val="Normal"/>
+    <w:next w:val="Normal"/>
+    <w:link w:val="SubtitleChar"/>
+    <w:uiPriority w:val="11"/>
+    <w:qFormat/>
+    <w:rsid w:val="00A028E0"/>
+    <w:pPr>
+      <w:numPr>
+        <w:ilvl w:val="1"/>
+      </w:numPr>
+    </w:pPr>
+    <w:rPr>
+      <w:rFonts w:eastAsiaTheme="minorEastAsia"/>
+      <w:color w:val="5A5A5A" w:themeColor="text1" w:themeTint="A5"/>
+      <w:spacing w:val="15"/>
+    </w:rPr>
+  </w:style>
+  <w:style w:type="character" w:customStyle="1" w:styleId="SubtitleChar">
+    <w:name w:val="Subtitle Char"/>
+    <w:basedOn w:val="DefaultParagraphFont"/>
+    <w:link w:val="Subtitle"/>
+    <w:uiPriority w:val="11"/>
+    <w:rsid w:val="00A028E0"/>
+    <w:rPr>
+      <w:rFonts w:eastAsiaTheme="minorEastAsia"/>
+      <w:color w:val="5A5A5A" w:themeColor="text1" w:themeTint="A5"/>
+      <w:spacing w:val="15"/>
     </w:rPr>
   </w:style>
 </w:styles>

</xml_diff>